<commit_message>
feat(report): add detailed AI574 project report
Made-with: Cursor
</commit_message>
<xml_diff>
--- a/AI574_Project_Report.docx
+++ b/AI574_Project_Report.docx
@@ -4,54 +4,39 @@
   <w:body>
     <w:p>
       <w:pPr>
-        <w:jc w:val="left"/>
+        <w:jc w:val="center"/>
       </w:pPr>
       <w:r>
         <w:rPr>
-          <w:rFonts w:ascii="Arial" w:hAnsi="Arial"/>
           <w:b/>
-          <w:color w:val="101010"/>
-          <w:sz w:val="56"/>
+          <w:sz w:val="36"/>
         </w:rPr>
-        <w:t>AI574 Final Project Report</w:t>
-      </w:r>
-    </w:p>
-    <w:p>
-      <w:r>
-        <w:rPr>
-          <w:rFonts w:ascii="Arial" w:hAnsi="Arial"/>
-          <w:i/>
-          <w:color w:val="555555"/>
-          <w:sz w:val="26"/>
-        </w:rPr>
-        <w:t>A Multi-Domain Corrective RAG Assistant with Supervisor-Routed Specialists</w:t>
-      </w:r>
-    </w:p>
-    <w:p>
-      <w:r>
-        <w:rPr>
-          <w:b w:val="0"/>
-          <w:i/>
-        </w:rPr>
-        <w:t>Audience: Developers and technical reviewers.</w:t>
-      </w:r>
-    </w:p>
-    <w:p>
-      <w:r>
-        <w:rPr>
-          <w:b w:val="0"/>
-          <w:i w:val="0"/>
-        </w:rPr>
-        <w:t>Revision: April 2026</w:t>
+        <w:t>AI574: Multi-Domain Corrective RAG Assistant</w:t>
       </w:r>
     </w:p>
     <w:p>
       <w:pPr>
-        <w:pBdr>
-          <w:bottom w:val="single" w:sz="6" w:space="1" w:color="2E75B6"/>
-        </w:pBdr>
+        <w:jc w:val="center"/>
       </w:pPr>
+      <w:r>
+        <w:t>Master’s Project Report — NLP &amp; Deep Learning (Course Objective: define an NLP problem, collect/process data, build neural-network-based models, train/evaluate)</w:t>
+      </w:r>
     </w:p>
+    <w:p>
+      <w:pPr>
+        <w:jc w:val="center"/>
+      </w:pPr>
+      <w:r>
+        <w:t>Author / Team: [Your Name(s)]</w:t>
+        <w:br/>
+        <w:t>Institution: Penn State</w:t>
+        <w:br/>
+        <w:t>Date: April 2026</w:t>
+        <w:br/>
+        <w:t>Revision: Detailed report</w:t>
+      </w:r>
+    </w:p>
+    <w:p/>
     <w:p>
       <w:pPr>
         <w:pStyle w:val="Heading1"/>
@@ -61,12 +46,11 @@
       </w:r>
     </w:p>
     <w:p>
+      <w:pPr>
+        <w:spacing w:after="120"/>
+      </w:pPr>
       <w:r>
-        <w:rPr>
-          <w:b w:val="0"/>
-          <w:i w:val="0"/>
-        </w:rPr>
-        <w:t>AI574 is a retrieval-augmented generation (RAG) system that demonstrates how a lightweight supervisor and a shared Corrective RAG (CRAG) pipeline can deliver domain-aware answers across three independent knowledge bases — industrial control troubleshooting, cooking assistance, and scientific literature — without training domain-specific generators. The system routes each query to a specialist agent, retrieves from a domain-scoped Chroma collection, grades and optionally rewrites the query, generates a grounded response, and validates that response against its sources. The design trades a small amount of routing latency for substantial gains in answer quality, grounding, and failure containment.</w:t>
+        <w:t>This report describes AI574, a multi-domain natural language assistant that combines a supervisor-routed multi-agent architecture with a shared Corrective Retrieval-Augmented Generation (CRAG) pipeline. User queries are classified into industrial control troubleshooting, recipe/cooking assistance, or scientific literature support; each specialist retrieves from a domain-isolated vector index, grades relevance, optionally rewrites the query, generates an answer conditioned on sources, and validates grounding. The system demonstrates modern NLP practice: large-scale data ingestion, dense retrieval with a pretrained transformer embedding model, and orchestrated use of large language models (LLMs) for routing, grading, generation, and validation—without training a new foundation model from scratch. We summarize datasets, preprocessing, architecture, implementation, evaluation hooks, observed index scale from notebook runs, limitations, and concrete improvements aligned with rigorous training and evaluation.</w:t>
       </w:r>
     </w:p>
     <w:p>
@@ -74,16 +58,23 @@
         <w:pStyle w:val="Heading1"/>
       </w:pPr>
       <w:r>
-        <w:t>1. Introduction</w:t>
+        <w:t>1. Introduction and Course Alignment</w:t>
       </w:r>
     </w:p>
     <w:p>
+      <w:pPr>
+        <w:spacing w:after="120"/>
+      </w:pPr>
       <w:r>
-        <w:rPr>
-          <w:b w:val="0"/>
-          <w:i w:val="0"/>
-        </w:rPr>
-        <w:t>General-purpose RAG systems tend to flatten domain semantics: a single embedding space and a single prompt template struggle when user intent spans domains with very different vocabularies (fault codes vs. cooking techniques vs. citation-heavy paper summaries). AI574 addresses this with a supervisor-first architecture. The supervisor is a narrow LLM-as-judge that classifies intent into one of five routes: three domain specialists, a clarify route for ambiguous queries, and a fallback for out-of-scope questions. Each specialist composes the same CRAG pipeline with domain-specific preprocessing, prompts, and postprocessing.</w:t>
+        <w:t>The course emphasizes defining a data-science-oriented NLP problem and solving it with deep neural networks, including dataset collection/processing, model construction, and performance evaluation. AI574 addresses a realistic industrial problem: trustworthy, domain-aware question answering over heterogeneous corpora where a single flat RAG stack often confuses vocabulary and retrieval objectives (e.g., PLC fault codes vs. recipe substitutions vs. ArXiv abstracts). The technical approach uses neural components throughout: sentence transformer embeddings for dense retrieval, and transformer-based LLMs for classification-as-routing, relevance grading, answer synthesis, and hallucination checking.</w:t>
+      </w:r>
+    </w:p>
+    <w:p>
+      <w:pPr>
+        <w:spacing w:after="120"/>
+      </w:pPr>
+      <w:r>
+        <w:t>Scope note: the primary contribution is systems-level—routing, retrieval, correction, and validation—rather than pretraining or supervised fine-tuning a new base LLM. This is common in applied NLP: pretrained encoders and generative models are composed into a testable pipeline. Section 9 proposes optional fine-tuning and benchmarking steps that would strengthen the “train and evaluate” narrative.</w:t>
       </w:r>
     </w:p>
     <w:p>
@@ -91,7 +82,39 @@
         <w:pStyle w:val="Heading1"/>
       </w:pPr>
       <w:r>
-        <w:t>2. Goals and Non-goals</w:t>
+        <w:t>2. Problem Statement</w:t>
+      </w:r>
+    </w:p>
+    <w:p>
+      <w:pPr>
+        <w:spacing w:after="120"/>
+      </w:pPr>
+      <w:r>
+        <w:t>Given a free-form user question, the system must: (1) infer the intended domain or ask for clarification; (2) retrieve relevant evidence from the correct knowledge base; (3) produce a helpful answer that stays consistent with retrieved sources; and (4) surface diagnostics (confidence, timing, sources) suitable for debugging and safe use—especially in the industrial domain.</w:t>
+      </w:r>
+    </w:p>
+    <w:p>
+      <w:pPr>
+        <w:pStyle w:val="Heading1"/>
+      </w:pPr>
+      <w:r>
+        <w:t>3. Background and Related Work</w:t>
+      </w:r>
+    </w:p>
+    <w:p>
+      <w:pPr>
+        <w:spacing w:after="120"/>
+      </w:pPr>
+      <w:r>
+        <w:t>Retrieval-Augmented Generation (RAG) grounds LLM outputs in external documents, reducing reliance on parametric memory. Corrective RAG extends this with explicit quality control: after retrieval, documents may be filtered or the query reformulated before generation, improving robustness when the first retrieval pass misses intent. Multi-agent and router patterns reduce interference between tasks or domains. Vector databases such as ChromaDB enable scalable approximate nearest-neighbor search over dense embeddings.</w:t>
+      </w:r>
+    </w:p>
+    <w:p>
+      <w:pPr>
+        <w:pStyle w:val="Heading1"/>
+      </w:pPr>
+      <w:r>
+        <w:t>4. Datasets, Collection, and Preprocessing</w:t>
       </w:r>
     </w:p>
     <w:p>
@@ -99,7 +122,135 @@
         <w:pStyle w:val="Heading2"/>
       </w:pPr>
       <w:r>
-        <w:t>2.1 Goals</w:t>
+        <w:t>4.1 Industrial</w:t>
+      </w:r>
+    </w:p>
+    <w:p>
+      <w:pPr>
+        <w:spacing w:after="120"/>
+      </w:pPr>
+      <w:r>
+        <w:t>Industrial knowledge is ingested from user-provided manuals and text under a configurable data directory (e.g., PDF, Markdown, plain text). When the industrial collection is empty, seeded starter text provides a minimal demo. Chunking uses a recursive character splitter; industrial text receives abbreviation expansion and equipment-oriented normalization to improve matching for fault codes and control terminology.</w:t>
+      </w:r>
+    </w:p>
+    <w:p>
+      <w:pPr>
+        <w:pStyle w:val="Heading2"/>
+      </w:pPr>
+      <w:r>
+        <w:t>4.2 Recipe</w:t>
+      </w:r>
+    </w:p>
+    <w:p>
+      <w:pPr>
+        <w:spacing w:after="120"/>
+      </w:pPr>
+      <w:r>
+        <w:t>The recipe domain indexes Food.com–style structured recipe data from RAW_recipes.csv (and optionally RAW_interactions.csv for popularity signals). The pipeline deduplicates, filters malformed rows, attaches metadata (e.g., dietary tags, timing), and batches embedding/upsert operations. Incremental re-indexing can skip existing chunk IDs to shorten rebuild cycles.</w:t>
+      </w:r>
+    </w:p>
+    <w:p>
+      <w:pPr>
+        <w:pStyle w:val="Heading2"/>
+      </w:pPr>
+      <w:r>
+        <w:t>4.3 Scientific</w:t>
+      </w:r>
+    </w:p>
+    <w:p>
+      <w:pPr>
+        <w:spacing w:after="120"/>
+      </w:pPr>
+      <w:r>
+        <w:t>Scientific coverage uses the Cornell ArXiv metadata snapshot (NDJSON), with configurable category and year filters (e.g., cs.* from 2020 onward in the notebook workflow). Abstracts and metadata are chunked and embedded; live ArXiv API usage can complement bulk indexing for misses.</w:t>
+      </w:r>
+    </w:p>
+    <w:p>
+      <w:pPr>
+        <w:pStyle w:val="Heading2"/>
+      </w:pPr>
+      <w:r>
+        <w:t>4.4 Observed index scale (representative notebook run)</w:t>
+      </w:r>
+    </w:p>
+    <w:p>
+      <w:pPr>
+        <w:spacing w:after="120"/>
+      </w:pPr>
+      <w:r>
+        <w:t>A full indexing run recorded in Multi_Domain_Agent.ipynb reported approximate Chroma document counts: ~6,150 industrial chunks, ~231,311 recipe chunks, and ~687,000 scientific chunks. Exact counts depend on filters, deduplication, and re-run policies; these figures illustrate operational scale rather than a fixed dataset statistic.</w:t>
+      </w:r>
+    </w:p>
+    <w:p>
+      <w:pPr>
+        <w:pStyle w:val="Heading1"/>
+      </w:pPr>
+      <w:r>
+        <w:t>5. System Architecture and Methodology</w:t>
+      </w:r>
+    </w:p>
+    <w:p>
+      <w:pPr>
+        <w:spacing w:after="120"/>
+      </w:pPr>
+      <w:r>
+        <w:t>High-level control flow: START → SupervisorAgent → {industrial | recipe | scientific | clarify | fallback} → domain agent → shared CRAGPipeline → finalize → END. Orchestration is implemented as a LangGraph workflow over a single AgentState that carries routing decisions, intermediate artifacts, sources, timing, and flags.</w:t>
+      </w:r>
+    </w:p>
+    <w:p>
+      <w:pPr>
+        <w:pStyle w:val="Heading2"/>
+      </w:pPr>
+      <w:r>
+        <w:t>5.1 CRAG loop</w:t>
+      </w:r>
+    </w:p>
+    <w:p>
+      <w:pPr>
+        <w:spacing w:after="120"/>
+      </w:pPr>
+      <w:r>
+        <w:t>CRAG stages: retrieve top-k from the domain collection → LLM-based document grading (batch with per-document fallback on parse errors) → query rewriting and retrieval retry up to max_rewrite_attempts → response generation with source conditioning → hallucination check / grounding validation. Failed validation can escalate so the caller can restrict or review the answer.</w:t>
+      </w:r>
+    </w:p>
+    <w:p>
+      <w:pPr>
+        <w:pStyle w:val="Heading2"/>
+      </w:pPr>
+      <w:r>
+        <w:t>5.2 Neural models</w:t>
+      </w:r>
+    </w:p>
+    <w:p>
+      <w:pPr>
+        <w:spacing w:after="120"/>
+      </w:pPr>
+      <w:r>
+        <w:t>Embeddings default to thenlper/gte-large (1024-dimensional vectors, cosine similarity in Chroma). Generation, routing, grading, rewriting, and validation use registered LLM backends: hosted Gemini (e.g., gemini_flash by default), optional Groq Llama, and local Gemma via KerasHub—selectable per query for latency/cost experiments.</w:t>
+      </w:r>
+    </w:p>
+    <w:p>
+      <w:pPr>
+        <w:pStyle w:val="Heading2"/>
+      </w:pPr>
+      <w:r>
+        <w:t>5.3 Infrastructure (Colab / persistence)</w:t>
+      </w:r>
+    </w:p>
+    <w:p>
+      <w:pPr>
+        <w:spacing w:after="120"/>
+      </w:pPr>
+      <w:r>
+        <w:t>The Multi_Domain_Agent notebook targets Google Colab with GPU, Google Drive for project artifacts, and a local SSD Chroma directory for SQLite reliability. Rolling tar.gz snapshots back up the vector store to Drive, with integrity checks and recovery helpers—important when indices reach hundreds of thousands of chunks.</w:t>
+      </w:r>
+    </w:p>
+    <w:p>
+      <w:pPr>
+        <w:pStyle w:val="Heading1"/>
+      </w:pPr>
+      <w:r>
+        <w:t>6. Implementation Highlights</w:t>
       </w:r>
     </w:p>
     <w:p>
@@ -107,7 +258,7 @@
         <w:pStyle w:val="ListBullet"/>
       </w:pPr>
       <w:r>
-        <w:t>Route queries correctly across heterogeneous domains without a large multi-task model.</w:t>
+        <w:t>Modular repo layout: orchestration/, agents/, rag_core/, foundation/, ingestion/, evaluation/.</w:t>
       </w:r>
     </w:p>
     <w:p>
@@ -115,7 +266,7 @@
         <w:pStyle w:val="ListBullet"/>
       </w:pPr>
       <w:r>
-        <w:t>Keep answers grounded in retrieved sources, with a mechanical check that catches hallucinations.</w:t>
+        <w:t>Supervisor: JSON-structured routing with confidence thresholding and clarify path for ambiguous input.</w:t>
       </w:r>
     </w:p>
     <w:p>
@@ -123,7 +274,7 @@
         <w:pStyle w:val="ListBullet"/>
       </w:pPr>
       <w:r>
-        <w:t>Allow runtime swapping of LLM providers so that hosted and local models can coexist.</w:t>
+        <w:t>Domain agents: industrial (safety-oriented postprocessing), recipe (substitutions, dietary metadata), scientific (ArXiv-oriented behavior).</w:t>
       </w:r>
     </w:p>
     <w:p>
@@ -131,7 +282,7 @@
         <w:pStyle w:val="ListBullet"/>
       </w:pPr>
       <w:r>
-        <w:t>Provide a single AgentState schema that makes the entire pipeline inspectable and debuggable.</w:t>
+        <w:t>Model registry and hosted adapter with auth-error failover to a configured local model ID.</w:t>
       </w:r>
     </w:p>
     <w:p>
@@ -139,15 +290,55 @@
         <w:pStyle w:val="ListBullet"/>
       </w:pPr>
       <w:r>
-        <w:t>Stay debuggable: per-stage timing, escalation reasons, and source attribution on every answer.</w:t>
+        <w:t>Unit tests with mocks for CRAG edge cases; notebooks for end-to-end validation.</w:t>
       </w:r>
     </w:p>
     <w:p>
       <w:pPr>
-        <w:pStyle w:val="Heading2"/>
+        <w:pStyle w:val="Heading1"/>
       </w:pPr>
       <w:r>
-        <w:t>2.2 Non-goals</w:t>
+        <w:t>7. Training, Inference, and Evaluation Posture</w:t>
+      </w:r>
+    </w:p>
+    <w:p>
+      <w:pPr>
+        <w:spacing w:after="120"/>
+      </w:pPr>
+      <w:r>
+        <w:t>The embedding encoder and LLMs are used in inference mode with frozen weights from public checkpoints. “Training” in the course sense is satisfied by: (a) data preparation and index construction as a supervised-free but compute-intensive pipeline; (b) hyperparameter choices (chunk size, top-k, grading thresholds, rewrite attempts); and (c) systematic evaluation of routing and answer quality. Recommended extensions (Section 9) include retrieval metric labeling, LLM-as-judge aggregates, and optional LoRA/adapter fine-tuning on a small domain-specific corpus if institutional constraints allow.</w:t>
+      </w:r>
+    </w:p>
+    <w:p>
+      <w:pPr>
+        <w:pStyle w:val="Heading1"/>
+      </w:pPr>
+      <w:r>
+        <w:t>8. Evaluation</w:t>
+      </w:r>
+    </w:p>
+    <w:p>
+      <w:pPr>
+        <w:spacing w:after="120"/>
+      </w:pPr>
+      <w:r>
+        <w:t>evaluation/metrics.py defines an Evaluator with routing accuracy over a query list (designed for expansion to ~50 queries per domain plus edge cases), LLM-judge scoring on relevance/accuracy/completeness/clarity, and verify_functional checks for non-empty responses, valid confidence, and timing schema. As of this report, the curated list is partially populated (placeholders note additional queries); formal tables of accuracy and latency should be produced once the suite is frozen and run against a fixed model configuration.</w:t>
+      </w:r>
+    </w:p>
+    <w:p>
+      <w:pPr>
+        <w:spacing w:after="120"/>
+      </w:pPr>
+      <w:r>
+        <w:t>Qualitative observations (from development and prior revision notes): the supervisor threshold trades responsiveness vs. clarification rate; batch grading reduces cost but requires robust JSON parsing fallbacks; industrial preprocessing improves recall for fault-code style queries; hallucination checks often flag confident answers with weak retrieval or wrong-document paraphrase.</w:t>
+      </w:r>
+    </w:p>
+    <w:p>
+      <w:pPr>
+        <w:pStyle w:val="Heading1"/>
+      </w:pPr>
+      <w:r>
+        <w:t>9. Recommended Improvements and Future Work</w:t>
       </w:r>
     </w:p>
     <w:p>
@@ -155,7 +346,7 @@
         <w:pStyle w:val="ListBullet"/>
       </w:pPr>
       <w:r>
-        <w:t>Training or fine-tuning a new foundation model.</w:t>
+        <w:t>Complete the routing benchmark: expand to 50 queries/domain + edge cases; report overall accuracy, per-domain accuracy, confusion matrix, and latency p50/p95.</w:t>
       </w:r>
     </w:p>
     <w:p>
@@ -163,7 +354,7 @@
         <w:pStyle w:val="ListBullet"/>
       </w:pPr>
       <w:r>
-        <w:t>A production-grade fallback that performs live web search (currently a static recommendation).</w:t>
+        <w:t>Retrieval ablations: vary top-k, chunk size, and metadata filters; measure precision@k with human or LLM labels on a fixed dev set.</w:t>
       </w:r>
     </w:p>
     <w:p>
@@ -171,7 +362,71 @@
         <w:pStyle w:val="ListBullet"/>
       </w:pPr>
       <w:r>
-        <w:t>Full PDF parsing for scientific queries; ArXiv abstracts and metadata are used by default.</w:t>
+        <w:t>CRAG ablations: disable or simplify grading, rewriting, or hallucination checking; quantify quality vs. latency and cost.</w:t>
+      </w:r>
+    </w:p>
+    <w:p>
+      <w:pPr>
+        <w:pStyle w:val="ListBullet"/>
+      </w:pPr>
+      <w:r>
+        <w:t>Model comparison: Gemini Flash vs. Pro vs. Groq Llama vs. local Gemma on the same query set; track grounding failures and escalation rate.</w:t>
+      </w:r>
+    </w:p>
+    <w:p>
+      <w:pPr>
+        <w:pStyle w:val="ListBullet"/>
+      </w:pPr>
+      <w:r>
+        <w:t>RAG quality metrics: citation coverage, answer-source consistency scores, and optional RAGAS-style automated metrics.</w:t>
+      </w:r>
+    </w:p>
+    <w:p>
+      <w:pPr>
+        <w:pStyle w:val="ListBullet"/>
+      </w:pPr>
+      <w:r>
+        <w:t>Robustness: sanitization before index, source allowlists, prompt-injection heuristics on retrieved chunks, stronger industrial safety disclaimers.</w:t>
+      </w:r>
+    </w:p>
+    <w:p>
+      <w:pPr>
+        <w:pStyle w:val="ListBullet"/>
+      </w:pPr>
+      <w:r>
+        <w:t>Reproducibility: pin optional dependencies in requirements.txt (e.g., langchain-text-splitters, transformers), provide a CLI or minimal API entrypoint, and version evaluation artifacts.</w:t>
+      </w:r>
+    </w:p>
+    <w:p>
+      <w:pPr>
+        <w:pStyle w:val="ListBullet"/>
+      </w:pPr>
+      <w:r>
+        <w:t>Observability: request IDs, structured JSON logs per node, and dashboards for routing confidence and CRAG stage timings.</w:t>
+      </w:r>
+    </w:p>
+    <w:p>
+      <w:pPr>
+        <w:pStyle w:val="ListBullet"/>
+      </w:pPr>
+      <w:r>
+        <w:t>Fallback: integrate a real web-search tool (e.g., Tavily) with ranked snippets instead of static text.</w:t>
+      </w:r>
+    </w:p>
+    <w:p>
+      <w:pPr>
+        <w:pStyle w:val="ListBullet"/>
+      </w:pPr>
+      <w:r>
+        <w:t>Scientific depth: optional full-text PDF ingestion with layout-aware parsing where resources permit.</w:t>
+      </w:r>
+    </w:p>
+    <w:p>
+      <w:pPr>
+        <w:pStyle w:val="ListBullet"/>
+      </w:pPr>
+      <w:r>
+        <w:t>Optional fine-tuning: small supervised dataset for routing or cross-encoder reranking to improve retrieval beyond bi-encoders.</w:t>
       </w:r>
     </w:p>
     <w:p>
@@ -179,262 +434,15 @@
         <w:pStyle w:val="Heading1"/>
       </w:pPr>
       <w:r>
-        <w:t>3. System Design</w:t>
+        <w:t>10. Limitations, Ethics, and Safety</w:t>
       </w:r>
     </w:p>
     <w:p>
       <w:pPr>
-        <w:pStyle w:val="Heading2"/>
+        <w:spacing w:after="120"/>
       </w:pPr>
       <w:r>
-        <w:t>3.1 High-level flow</w:t>
-      </w:r>
-    </w:p>
-    <w:p>
-      <w:pPr>
-        <w:pStyle w:val="CodeBlock"/>
-        <w:shd w:val="clear" w:color="auto" w:fill="F3F3F3"/>
-      </w:pPr>
-      <w:r>
-        <w:rPr>
-          <w:rFonts w:ascii="Consolas" w:hAnsi="Consolas"/>
-          <w:sz w:val="19"/>
-        </w:rPr>
-        <w:t>START → supervisor → {industrial | recipe | scientific | clarify | fallback} → finalize → END</w:t>
-      </w:r>
-      <w:r>
-        <w:br/>
-      </w:r>
-      <w:r>
-        <w:rPr>
-          <w:rFonts w:ascii="Consolas" w:hAnsi="Consolas"/>
-          <w:sz w:val="19"/>
-        </w:rPr>
-        <w:t>Each specialist runs CRAG: retrieve → grade → rewrite → generate → hallucination check</w:t>
-      </w:r>
-    </w:p>
-    <w:p>
-      <w:pPr>
-        <w:pStyle w:val="Heading2"/>
-      </w:pPr>
-      <w:r>
-        <w:t>3.2 Component responsibilities</w:t>
-      </w:r>
-    </w:p>
-    <w:tbl>
-      <w:tblPr>
-        <w:tblStyle w:val="LightGrid-Accent1"/>
-        <w:tblW w:type="auto" w:w="0"/>
-        <w:tblLook w:firstColumn="1" w:firstRow="1" w:lastColumn="0" w:lastRow="0" w:noHBand="0" w:noVBand="1" w:val="04A0"/>
-      </w:tblPr>
-      <w:tblGrid>
-        <w:gridCol w:w="4320"/>
-        <w:gridCol w:w="4320"/>
-      </w:tblGrid>
-      <w:tr>
-        <w:tc>
-          <w:tcPr>
-            <w:tcW w:type="dxa" w:w="2880"/>
-            <w:shd w:val="clear" w:color="auto" w:fill="2E75B6"/>
-          </w:tcPr>
-          <w:p>
-            <w:r/>
-            <w:r>
-              <w:rPr>
-                <w:b/>
-                <w:color w:val="FFFFFF"/>
-              </w:rPr>
-              <w:t>Component</w:t>
-            </w:r>
-          </w:p>
-        </w:tc>
-        <w:tc>
-          <w:tcPr>
-            <w:tcW w:type="dxa" w:w="7200"/>
-            <w:shd w:val="clear" w:color="auto" w:fill="2E75B6"/>
-          </w:tcPr>
-          <w:p>
-            <w:r/>
-            <w:r>
-              <w:rPr>
-                <w:b/>
-                <w:color w:val="FFFFFF"/>
-              </w:rPr>
-              <w:t>Responsibility</w:t>
-            </w:r>
-          </w:p>
-        </w:tc>
-      </w:tr>
-      <w:tr>
-        <w:tc>
-          <w:tcPr>
-            <w:tcW w:type="dxa" w:w="2880"/>
-          </w:tcPr>
-          <w:p>
-            <w:r/>
-            <w:r>
-              <w:t>SupervisorAgent</w:t>
-            </w:r>
-          </w:p>
-        </w:tc>
-        <w:tc>
-          <w:tcPr>
-            <w:tcW w:type="dxa" w:w="7200"/>
-          </w:tcPr>
-          <w:p>
-            <w:r/>
-            <w:r>
-              <w:t>LLM-as-judge routing with a confidence threshold and a deterministic fallback path</w:t>
-            </w:r>
-          </w:p>
-        </w:tc>
-      </w:tr>
-      <w:tr>
-        <w:tc>
-          <w:tcPr>
-            <w:tcW w:type="dxa" w:w="2880"/>
-          </w:tcPr>
-          <w:p>
-            <w:r/>
-            <w:r>
-              <w:t>Domain agents</w:t>
-            </w:r>
-          </w:p>
-        </w:tc>
-        <w:tc>
-          <w:tcPr>
-            <w:tcW w:type="dxa" w:w="7200"/>
-          </w:tcPr>
-          <w:p>
-            <w:r/>
-            <w:r>
-              <w:t>Domain-specific query preprocessing and response postprocessing</w:t>
-            </w:r>
-          </w:p>
-        </w:tc>
-      </w:tr>
-      <w:tr>
-        <w:tc>
-          <w:tcPr>
-            <w:tcW w:type="dxa" w:w="2880"/>
-          </w:tcPr>
-          <w:p>
-            <w:r/>
-            <w:r>
-              <w:t>CRAGPipeline</w:t>
-            </w:r>
-          </w:p>
-        </w:tc>
-        <w:tc>
-          <w:tcPr>
-            <w:tcW w:type="dxa" w:w="7200"/>
-          </w:tcPr>
-          <w:p>
-            <w:r/>
-            <w:r>
-              <w:t>Retrieve, grade, rewrite, generate, and validate; escalate on failure</w:t>
-            </w:r>
-          </w:p>
-        </w:tc>
-      </w:tr>
-      <w:tr>
-        <w:tc>
-          <w:tcPr>
-            <w:tcW w:type="dxa" w:w="2880"/>
-          </w:tcPr>
-          <w:p>
-            <w:r/>
-            <w:r>
-              <w:t>VectorStoreService</w:t>
-            </w:r>
-          </w:p>
-        </w:tc>
-        <w:tc>
-          <w:tcPr>
-            <w:tcW w:type="dxa" w:w="7200"/>
-          </w:tcPr>
-          <w:p>
-            <w:r/>
-            <w:r>
-              <w:t>Per-domain Chroma collections with an LRU cache for repeated query embeddings</w:t>
-            </w:r>
-          </w:p>
-        </w:tc>
-      </w:tr>
-      <w:tr>
-        <w:tc>
-          <w:tcPr>
-            <w:tcW w:type="dxa" w:w="2880"/>
-          </w:tcPr>
-          <w:p>
-            <w:r/>
-            <w:r>
-              <w:t>Model registry</w:t>
-            </w:r>
-          </w:p>
-        </w:tc>
-        <w:tc>
-          <w:tcPr>
-            <w:tcW w:type="dxa" w:w="7200"/>
-          </w:tcPr>
-          <w:p>
-            <w:r/>
-            <w:r>
-              <w:t>Runtime LLM selection, plus auth-error failover via HostedChatModelAdapter</w:t>
-            </w:r>
-          </w:p>
-        </w:tc>
-      </w:tr>
-    </w:tbl>
-    <w:p>
-      <w:pPr>
-        <w:pStyle w:val="Heading2"/>
-      </w:pPr>
-      <w:r>
-        <w:t>3.3 Orchestration</w:t>
-      </w:r>
-    </w:p>
-    <w:p>
-      <w:r>
-        <w:rPr>
-          <w:b w:val="0"/>
-          <w:i w:val="0"/>
-        </w:rPr>
-        <w:t>The workflow is compiled as a LangGraph state machine. Every node reads and writes a single AgentState TypedDict, which also carries per-node timing. run_query is a thin wrapper that seeds the state, invokes the compiled graph, and returns a dictionary shaped around the caller's needs: domain, confidence, response, sources, timing, and diagnostic flags.</w:t>
-      </w:r>
-    </w:p>
-    <w:p>
-      <w:pPr>
-        <w:pStyle w:val="Heading2"/>
-      </w:pPr>
-      <w:r>
-        <w:t>3.4 Retrieval and chunking</w:t>
-      </w:r>
-    </w:p>
-    <w:p>
-      <w:r>
-        <w:rPr>
-          <w:b w:val="0"/>
-          <w:i w:val="0"/>
-        </w:rPr>
-        <w:t>Documents are chunked with a recursive character splitter configured for roughly 768-token chunks with 15 percent overlap. For the industrial domain, a preprocessing pass expands common abbreviations (PLC → Programmable Logic Controller (PLC)) and normalizes equipment codes before embedding so that fault-code queries match chunks regardless of surface form. Embeddings default to thenlper/gte-large (1024-dim) with cosine similarity.</w:t>
-      </w:r>
-    </w:p>
-    <w:p>
-      <w:pPr>
-        <w:pStyle w:val="Heading2"/>
-      </w:pPr>
-      <w:r>
-        <w:t>3.5 Corrective RAG loop</w:t>
-      </w:r>
-    </w:p>
-    <w:p>
-      <w:r>
-        <w:rPr>
-          <w:b w:val="0"/>
-          <w:i w:val="0"/>
-        </w:rPr>
-        <w:t>The CRAG loop is what gives the system its corrective character. After retrieval, the document grader classifies each document as relevant, ambiguous, or irrelevant using an LLM-as-judge. If the grader reports insufficient context, the query rewriter reformulates the query — expanding abbreviations, adding domain terms, and decomposing multi-part questions — and retrieval runs again, up to max_rewrite_attempts times. The generator then produces a grounded response, and the hallucination checker performs a final validation pass. If that validation fails, the result is flagged as escalated so the caller can decide whether to surface it or trigger a human-in-the-loop path.</w:t>
+        <w:t>Industrial answers must be treated as decision support only—always follow manufacturer documentation and site safety procedures. Scientific answers depend on abstract-level retrieval; citation-heavy claims may require full text. Hosted APIs require key management; notebooks should not commit secrets. The system assumes indexed content is benign; untrusted corpora increase prompt-injection and retrieval-poisoning risk.</w:t>
       </w:r>
     </w:p>
     <w:p>
@@ -442,7 +450,23 @@
         <w:pStyle w:val="Heading1"/>
       </w:pPr>
       <w:r>
-        <w:t>4. Implementation Highlights</w:t>
+        <w:t>11. Conclusion</w:t>
+      </w:r>
+    </w:p>
+    <w:p>
+      <w:pPr>
+        <w:spacing w:after="120"/>
+      </w:pPr>
+      <w:r>
+        <w:t>AI574 demonstrates that explicit routing, domain-scoped retrieval, and a corrective generation loop can deliver grounded, debuggable NLP behavior across heterogeneous domains using modern deep models for embeddings and language. The strongest next steps for a master’s submission are rigorous benchmarking (routing + RAG quality), documented ablations, and reproducible packaging beyond notebook-only execution.</w:t>
+      </w:r>
+    </w:p>
+    <w:p>
+      <w:pPr>
+        <w:pStyle w:val="Heading1"/>
+      </w:pPr>
+      <w:r>
+        <w:t>References (illustrative)</w:t>
       </w:r>
     </w:p>
     <w:p>
@@ -450,13 +474,7 @@
         <w:pStyle w:val="ListBullet"/>
       </w:pPr>
       <w:r>
-        <w:rPr>
-          <w:b/>
-        </w:rPr>
-        <w:t xml:space="preserve">KerasHub bridge: </w:t>
-      </w:r>
-      <w:r>
-        <w:t>KerasHubChatModel implements the LangChain BaseChatModel contract on top of KerasHub presets (Gemma3/Gemma2/Llama3.1), including prompt formatting per model family and strict echo stripping.</w:t>
+        <w:t>Lewis, P., et al. Retrieval-Augmented Generation for Knowledge-Intensive NLP Tasks. NeurIPS 2020.</w:t>
       </w:r>
     </w:p>
     <w:p>
@@ -464,13 +482,7 @@
         <w:pStyle w:val="ListBullet"/>
       </w:pPr>
       <w:r>
-        <w:rPr>
-          <w:b/>
-        </w:rPr>
-        <w:t xml:space="preserve">Batch grading: </w:t>
-      </w:r>
-      <w:r>
-        <w:t>DocumentGrader grades documents in small batches to cut LLM calls per retrieval, with a per-doc fallback when the batch JSON cannot be parsed.</w:t>
+        <w:t>LangChain / LangGraph documentation — agent and graph orchestration patterns.</w:t>
       </w:r>
     </w:p>
     <w:p>
@@ -478,13 +490,7 @@
         <w:pStyle w:val="ListBullet"/>
       </w:pPr>
       <w:r>
-        <w:rPr>
-          <w:b/>
-        </w:rPr>
-        <w:t xml:space="preserve">Runtime model switching: </w:t>
-      </w:r>
-      <w:r>
-        <w:t>The model registry lets the caller pick a model per query without rebuilding the workflow. Compiled workflows are cached per model_id.</w:t>
+        <w:t>ChromaDB documentation — vector persistence and collections.</w:t>
       </w:r>
     </w:p>
     <w:p>
@@ -492,13 +498,7 @@
         <w:pStyle w:val="ListBullet"/>
       </w:pPr>
       <w:r>
-        <w:rPr>
-          <w:b/>
-        </w:rPr>
-        <w:t xml:space="preserve">Auth-error failover: </w:t>
-      </w:r>
-      <w:r>
-        <w:t>HostedChatModelAdapter catches 401/403 responses and fails over to a local model so a revoked API key does not take the system offline.</w:t>
+        <w:t>Sentence-Transformers / GTE — dense embedding models (thenlper/gte-large).</w:t>
       </w:r>
     </w:p>
     <w:p>
@@ -506,13 +506,15 @@
         <w:pStyle w:val="ListBullet"/>
       </w:pPr>
       <w:r>
-        <w:rPr>
-          <w:b/>
-        </w:rPr>
-        <w:t xml:space="preserve">Inspectable state: </w:t>
+        <w:t>ArXiv OAI metadata — Cornell University snapshot (Kaggle / public dump).</w:t>
       </w:r>
+    </w:p>
+    <w:p>
+      <w:pPr>
+        <w:pStyle w:val="ListBullet"/>
+      </w:pPr>
       <w:r>
-        <w:t>AgentState aggregates timing, routing reasoning, escalation reasons, and source attribution in one place, simplifying observability.</w:t>
+        <w:t>Food.com recipe data — community recipe corpus (as used in indexing scripts).</w:t>
       </w:r>
     </w:p>
     <w:p>
@@ -520,442 +522,12 @@
         <w:pStyle w:val="Heading1"/>
       </w:pPr>
       <w:r>
-        <w:t>5. Evaluation</w:t>
-      </w:r>
-    </w:p>
-    <w:p>
-      <w:r>
-        <w:rPr>
-          <w:b w:val="0"/>
-          <w:i w:val="0"/>
-        </w:rPr>
-        <w:t>evaluation/metrics.py defines 150 test queries (50 per domain) plus edge cases, along with an EvaluationResult dataclass capturing routing accuracy, task completion rate, average latency, and self-correction rate. The suite is written so it can be driven from a notebook against any registered model for apples-to-apples comparison.</w:t>
-      </w:r>
-    </w:p>
-    <w:p>
-      <w:pPr>
-        <w:pStyle w:val="Heading2"/>
-      </w:pPr>
-      <w:r>
-        <w:t>5.1 Metrics captured</w:t>
+        <w:t>Appendix A: Key Configuration (defaults)</w:t>
       </w:r>
     </w:p>
     <w:tbl>
       <w:tblPr>
-        <w:tblStyle w:val="LightGrid-Accent1"/>
-        <w:tblW w:type="auto" w:w="0"/>
-        <w:tblLook w:firstColumn="1" w:firstRow="1" w:lastColumn="0" w:lastRow="0" w:noHBand="0" w:noVBand="1" w:val="04A0"/>
-      </w:tblPr>
-      <w:tblGrid>
-        <w:gridCol w:w="4320"/>
-        <w:gridCol w:w="4320"/>
-      </w:tblGrid>
-      <w:tr>
-        <w:tc>
-          <w:tcPr>
-            <w:tcW w:type="dxa" w:w="3168"/>
-            <w:shd w:val="clear" w:color="auto" w:fill="2E75B6"/>
-          </w:tcPr>
-          <w:p>
-            <w:r/>
-            <w:r>
-              <w:rPr>
-                <w:b/>
-                <w:color w:val="FFFFFF"/>
-              </w:rPr>
-              <w:t>Metric</w:t>
-            </w:r>
-          </w:p>
-        </w:tc>
-        <w:tc>
-          <w:tcPr>
-            <w:tcW w:type="dxa" w:w="6912"/>
-            <w:shd w:val="clear" w:color="auto" w:fill="2E75B6"/>
-          </w:tcPr>
-          <w:p>
-            <w:r/>
-            <w:r>
-              <w:rPr>
-                <w:b/>
-                <w:color w:val="FFFFFF"/>
-              </w:rPr>
-              <w:t>What it measures</w:t>
-            </w:r>
-          </w:p>
-        </w:tc>
-      </w:tr>
-      <w:tr>
-        <w:tc>
-          <w:tcPr>
-            <w:tcW w:type="dxa" w:w="3168"/>
-          </w:tcPr>
-          <w:p>
-            <w:r/>
-            <w:r>
-              <w:t>Routing accuracy</w:t>
-            </w:r>
-          </w:p>
-        </w:tc>
-        <w:tc>
-          <w:tcPr>
-            <w:tcW w:type="dxa" w:w="6912"/>
-          </w:tcPr>
-          <w:p>
-            <w:r/>
-            <w:r>
-              <w:t>Fraction of queries classified into the intended domain</w:t>
-            </w:r>
-          </w:p>
-        </w:tc>
-      </w:tr>
-      <w:tr>
-        <w:tc>
-          <w:tcPr>
-            <w:tcW w:type="dxa" w:w="3168"/>
-          </w:tcPr>
-          <w:p>
-            <w:r/>
-            <w:r>
-              <w:t>Task completion rate</w:t>
-            </w:r>
-          </w:p>
-        </w:tc>
-        <w:tc>
-          <w:tcPr>
-            <w:tcW w:type="dxa" w:w="6912"/>
-          </w:tcPr>
-          <w:p>
-            <w:r/>
-            <w:r>
-              <w:t>Fraction of non-escalated, grounded responses</w:t>
-            </w:r>
-          </w:p>
-        </w:tc>
-      </w:tr>
-      <w:tr>
-        <w:tc>
-          <w:tcPr>
-            <w:tcW w:type="dxa" w:w="3168"/>
-          </w:tcPr>
-          <w:p>
-            <w:r/>
-            <w:r>
-              <w:t>Avg. latency (seconds)</w:t>
-            </w:r>
-          </w:p>
-        </w:tc>
-        <w:tc>
-          <w:tcPr>
-            <w:tcW w:type="dxa" w:w="6912"/>
-          </w:tcPr>
-          <w:p>
-            <w:r/>
-            <w:r>
-              <w:t>End-to-end p50 latency per query</w:t>
-            </w:r>
-          </w:p>
-        </w:tc>
-      </w:tr>
-      <w:tr>
-        <w:tc>
-          <w:tcPr>
-            <w:tcW w:type="dxa" w:w="3168"/>
-          </w:tcPr>
-          <w:p>
-            <w:r/>
-            <w:r>
-              <w:t>Self-correction rate</w:t>
-            </w:r>
-          </w:p>
-        </w:tc>
-        <w:tc>
-          <w:tcPr>
-            <w:tcW w:type="dxa" w:w="6912"/>
-          </w:tcPr>
-          <w:p>
-            <w:r/>
-            <w:r>
-              <w:t>Fraction of queries that required at least one rewrite</w:t>
-            </w:r>
-          </w:p>
-        </w:tc>
-      </w:tr>
-    </w:tbl>
-    <w:p>
-      <w:pPr>
-        <w:pStyle w:val="Heading2"/>
-      </w:pPr>
-      <w:r>
-        <w:t>5.2 Qualitative observations</w:t>
-      </w:r>
-    </w:p>
-    <w:p>
-      <w:pPr>
-        <w:pStyle w:val="ListBullet"/>
-      </w:pPr>
-      <w:r>
-        <w:t>The supervisor is the biggest quality lever: raising the confidence threshold surfaces more clarify responses, which improves grounding but worsens perceived responsiveness.</w:t>
-      </w:r>
-    </w:p>
-    <w:p>
-      <w:pPr>
-        <w:pStyle w:val="ListBullet"/>
-      </w:pPr>
-      <w:r>
-        <w:t>The batch grader is materially cheaper than per-document grading, but is sensitive to JSON formatting. The per-doc fallback is essential for robustness on smaller local models.</w:t>
-      </w:r>
-    </w:p>
-    <w:p>
-      <w:pPr>
-        <w:pStyle w:val="ListBullet"/>
-      </w:pPr>
-      <w:r>
-        <w:t>On industrial queries, fault-code normalization in preprocessing delivers a larger recall improvement than any single retrieval-side tweak.</w:t>
-      </w:r>
-    </w:p>
-    <w:p>
-      <w:pPr>
-        <w:pStyle w:val="ListBullet"/>
-      </w:pPr>
-      <w:r>
-        <w:t>The hallucination check mostly escalates on two failure modes: empty retrievals that still produced a confidently-worded answer, and answers that paraphrased adjacent-but-unrelated documents.</w:t>
-      </w:r>
-    </w:p>
-    <w:p>
-      <w:pPr>
-        <w:pStyle w:val="Heading1"/>
-      </w:pPr>
-      <w:r>
-        <w:t>6. Limitations</w:t>
-      </w:r>
-    </w:p>
-    <w:p>
-      <w:pPr>
-        <w:pStyle w:val="ListBullet"/>
-      </w:pPr>
-      <w:r>
-        <w:t>The fallback route returns a static recommendation rather than a real web search — live search integration (e.g., Tavily) is designed in but not yet wired up.</w:t>
-      </w:r>
-    </w:p>
-    <w:p>
-      <w:pPr>
-        <w:pStyle w:val="ListBullet"/>
-      </w:pPr>
-      <w:r>
-        <w:t>Scientific retrieval relies on ArXiv abstracts and metadata. Full-paper parsing would improve answers for citation-heavy queries but requires meaningful additional ingestion infrastructure.</w:t>
-      </w:r>
-    </w:p>
-    <w:p>
-      <w:pPr>
-        <w:pStyle w:val="ListBullet"/>
-      </w:pPr>
-      <w:r>
-        <w:t>Integration and end-to-end tests are thin; unit coverage is solid, but workflow-level regressions are caught primarily by running the notebooks.</w:t>
-      </w:r>
-    </w:p>
-    <w:p>
-      <w:pPr>
-        <w:pStyle w:val="ListBullet"/>
-      </w:pPr>
-      <w:r>
-        <w:t>The system assumes that indexed content is trustworthy. Indexing user-generated content without added sanitization would expose the generator to prompt injection.</w:t>
-      </w:r>
-    </w:p>
-    <w:p>
-      <w:pPr>
-        <w:pStyle w:val="ListBullet"/>
-      </w:pPr>
-      <w:r>
-        <w:t>Two imports (langchain-text-splitters, transformers) are not yet pinned in requirements.txt.</w:t>
-      </w:r>
-    </w:p>
-    <w:p>
-      <w:pPr>
-        <w:pStyle w:val="Heading1"/>
-      </w:pPr>
-      <w:r>
-        <w:t>7. Future Work</w:t>
-      </w:r>
-    </w:p>
-    <w:p>
-      <w:pPr>
-        <w:pStyle w:val="ListBullet"/>
-      </w:pPr>
-      <w:r>
-        <w:t>Wire up a real fallback search provider and add a small ranker on top of search snippets.</w:t>
-      </w:r>
-    </w:p>
-    <w:p>
-      <w:pPr>
-        <w:pStyle w:val="ListBullet"/>
-      </w:pPr>
-      <w:r>
-        <w:t>Add full-text scientific ingestion (PDF parsing + figure/table extraction).</w:t>
-      </w:r>
-    </w:p>
-    <w:p>
-      <w:pPr>
-        <w:pStyle w:val="ListBullet"/>
-      </w:pPr>
-      <w:r>
-        <w:t>Ship a canonical CLI or lightweight HTTP service so the system has a production entrypoint outside notebooks.</w:t>
-      </w:r>
-    </w:p>
-    <w:p>
-      <w:pPr>
-        <w:pStyle w:val="ListBullet"/>
-      </w:pPr>
-      <w:r>
-        <w:t>Expand the evaluation harness into a nightly job that tracks routing accuracy and self-correction rates over time.</w:t>
-      </w:r>
-    </w:p>
-    <w:p>
-      <w:pPr>
-        <w:pStyle w:val="ListBullet"/>
-      </w:pPr>
-      <w:r>
-        <w:t>Add structured observability: request IDs, OpenTelemetry spans per node, and a dashboard for p50/p95 latency.</w:t>
-      </w:r>
-    </w:p>
-    <w:p>
-      <w:pPr>
-        <w:pStyle w:val="Heading1"/>
-      </w:pPr>
-      <w:r>
-        <w:t>8. Conclusion</w:t>
-      </w:r>
-    </w:p>
-    <w:p>
-      <w:r>
-        <w:rPr>
-          <w:b w:val="0"/>
-          <w:i w:val="0"/>
-        </w:rPr>
-        <w:t>AI574 shows that a modest amount of structure — a supervisor, a shared corrective loop, and per-domain preprocessing — buys a large amount of quality and debuggability on top of off-the-shelf LLMs and embeddings. The architecture cleanly separates routing, retrieval, correction, and validation, which makes each piece independently replaceable. The most valuable future investment is closing the remaining observability and integration-testing gaps so that the same pipeline can be operated with confidence outside of notebook demos.</w:t>
-      </w:r>
-    </w:p>
-    <w:p>
-      <w:pPr>
-        <w:pStyle w:val="Heading1"/>
-      </w:pPr>
-      <w:r>
-        <w:t>Appendix A: File Map</w:t>
-      </w:r>
-    </w:p>
-    <w:p>
-      <w:pPr>
-        <w:pStyle w:val="CodeBlock"/>
-        <w:shd w:val="clear" w:color="auto" w:fill="F3F3F3"/>
-      </w:pPr>
-      <w:r>
-        <w:rPr>
-          <w:rFonts w:ascii="Consolas" w:hAnsi="Consolas"/>
-          <w:sz w:val="19"/>
-        </w:rPr>
-        <w:t>agents/      base_agent.py, industrial_agent.py, recipe_agent.py, scientific_agent.py</w:t>
-      </w:r>
-      <w:r>
-        <w:br/>
-      </w:r>
-      <w:r>
-        <w:rPr>
-          <w:rFonts w:ascii="Consolas" w:hAnsi="Consolas"/>
-          <w:sz w:val="19"/>
-        </w:rPr>
-        <w:t>config/      settings.py, prompts.py</w:t>
-      </w:r>
-      <w:r>
-        <w:br/>
-      </w:r>
-      <w:r>
-        <w:rPr>
-          <w:rFonts w:ascii="Consolas" w:hAnsi="Consolas"/>
-          <w:sz w:val="19"/>
-        </w:rPr>
-        <w:t>evaluation/  metrics.py</w:t>
-      </w:r>
-      <w:r>
-        <w:br/>
-      </w:r>
-      <w:r>
-        <w:rPr>
-          <w:rFonts w:ascii="Consolas" w:hAnsi="Consolas"/>
-          <w:sz w:val="19"/>
-        </w:rPr>
-        <w:t>foundation/  llm_wrapper.py, embedding_service.py, vector_store.py, model_registry.py</w:t>
-      </w:r>
-      <w:r>
-        <w:br/>
-      </w:r>
-      <w:r>
-        <w:rPr>
-          <w:rFonts w:ascii="Consolas" w:hAnsi="Consolas"/>
-          <w:sz w:val="19"/>
-        </w:rPr>
-        <w:t>ingestion/   document_loader.py, chunking_pipeline.py, index_builder.py</w:t>
-      </w:r>
-      <w:r>
-        <w:br/>
-      </w:r>
-      <w:r>
-        <w:rPr>
-          <w:rFonts w:ascii="Consolas" w:hAnsi="Consolas"/>
-          <w:sz w:val="19"/>
-        </w:rPr>
-        <w:t>notebooks/   main_demo.ipynb, Multi_Domain_Agent.ipynb</w:t>
-      </w:r>
-      <w:r>
-        <w:br/>
-      </w:r>
-      <w:r>
-        <w:rPr>
-          <w:rFonts w:ascii="Consolas" w:hAnsi="Consolas"/>
-          <w:sz w:val="19"/>
-        </w:rPr>
-        <w:t>orchestration/ state_schema.py, supervisor.py, workflow_graph.py</w:t>
-      </w:r>
-      <w:r>
-        <w:br/>
-      </w:r>
-      <w:r>
-        <w:rPr>
-          <w:rFonts w:ascii="Consolas" w:hAnsi="Consolas"/>
-          <w:sz w:val="19"/>
-        </w:rPr>
-        <w:t>rag_core/    crag_pipeline.py, retriever.py, document_grader.py, query_rewriter.py,</w:t>
-      </w:r>
-      <w:r>
-        <w:br/>
-      </w:r>
-      <w:r>
-        <w:rPr>
-          <w:rFonts w:ascii="Consolas" w:hAnsi="Consolas"/>
-          <w:sz w:val="19"/>
-        </w:rPr>
-        <w:t xml:space="preserve">             response_generator.py, hallucination_checker.py</w:t>
-      </w:r>
-      <w:r>
-        <w:br/>
-      </w:r>
-      <w:r>
-        <w:rPr>
-          <w:rFonts w:ascii="Consolas" w:hAnsi="Consolas"/>
-          <w:sz w:val="19"/>
-        </w:rPr>
-        <w:t>tests/       test_crag_pipeline.py, test_security.py</w:t>
-      </w:r>
-    </w:p>
-    <w:p>
-      <w:pPr>
-        <w:pStyle w:val="Heading1"/>
-      </w:pPr>
-      <w:r>
-        <w:t>Appendix B: Key Configuration</w:t>
-      </w:r>
-    </w:p>
-    <w:tbl>
-      <w:tblPr>
-        <w:tblStyle w:val="LightGrid-Accent1"/>
+        <w:tblStyle w:val="TableGrid"/>
         <w:tblW w:type="auto" w:w="0"/>
         <w:tblLook w:firstColumn="1" w:firstRow="1" w:lastColumn="0" w:lastRow="0" w:noHBand="0" w:noVBand="1" w:val="04A0"/>
       </w:tblPr>
@@ -967,49 +539,31 @@
       <w:tr>
         <w:tc>
           <w:tcPr>
-            <w:tcW w:type="dxa" w:w="3168"/>
-            <w:shd w:val="clear" w:color="auto" w:fill="2E75B6"/>
+            <w:tcW w:type="dxa" w:w="2880"/>
           </w:tcPr>
           <w:p>
-            <w:r/>
             <w:r>
-              <w:rPr>
-                <w:b/>
-                <w:color w:val="FFFFFF"/>
-              </w:rPr>
               <w:t>Setting</w:t>
             </w:r>
           </w:p>
         </w:tc>
         <w:tc>
           <w:tcPr>
-            <w:tcW w:type="dxa" w:w="2592"/>
-            <w:shd w:val="clear" w:color="auto" w:fill="2E75B6"/>
+            <w:tcW w:type="dxa" w:w="2880"/>
           </w:tcPr>
           <w:p>
-            <w:r/>
             <w:r>
-              <w:rPr>
-                <w:b/>
-                <w:color w:val="FFFFFF"/>
-              </w:rPr>
               <w:t>Default</w:t>
             </w:r>
           </w:p>
         </w:tc>
         <w:tc>
           <w:tcPr>
-            <w:tcW w:type="dxa" w:w="3456"/>
-            <w:shd w:val="clear" w:color="auto" w:fill="2E75B6"/>
+            <w:tcW w:type="dxa" w:w="2880"/>
           </w:tcPr>
           <w:p>
-            <w:r/>
             <w:r>
-              <w:rPr>
-                <w:b/>
-                <w:color w:val="FFFFFF"/>
-              </w:rPr>
-              <w:t>Where</w:t>
+              <w:t>Module / role</w:t>
             </w:r>
           </w:p>
         </w:tc>
@@ -1017,10 +571,9 @@
       <w:tr>
         <w:tc>
           <w:tcPr>
-            <w:tcW w:type="dxa" w:w="3168"/>
+            <w:tcW w:type="dxa" w:w="2880"/>
           </w:tcPr>
           <w:p>
-            <w:r/>
             <w:r>
               <w:t>routing_confidence_threshold</w:t>
             </w:r>
@@ -1028,10 +581,9 @@
         </w:tc>
         <w:tc>
           <w:tcPr>
-            <w:tcW w:type="dxa" w:w="2592"/>
+            <w:tcW w:type="dxa" w:w="2880"/>
           </w:tcPr>
           <w:p>
-            <w:r/>
             <w:r>
               <w:t>0.75</w:t>
             </w:r>
@@ -1039,12 +591,11 @@
         </w:tc>
         <w:tc>
           <w:tcPr>
-            <w:tcW w:type="dxa" w:w="3456"/>
+            <w:tcW w:type="dxa" w:w="2880"/>
           </w:tcPr>
           <w:p>
-            <w:r/>
             <w:r>
-              <w:t>SupervisorConfig</w:t>
+              <w:t>SupervisorConfig — below → clarify</w:t>
             </w:r>
           </w:p>
         </w:tc>
@@ -1052,10 +603,9 @@
       <w:tr>
         <w:tc>
           <w:tcPr>
-            <w:tcW w:type="dxa" w:w="3168"/>
+            <w:tcW w:type="dxa" w:w="2880"/>
           </w:tcPr>
           <w:p>
-            <w:r/>
             <w:r>
               <w:t>max_rewrite_attempts</w:t>
             </w:r>
@@ -1063,10 +613,9 @@
         </w:tc>
         <w:tc>
           <w:tcPr>
-            <w:tcW w:type="dxa" w:w="2592"/>
+            <w:tcW w:type="dxa" w:w="2880"/>
           </w:tcPr>
           <w:p>
-            <w:r/>
             <w:r>
               <w:t>2</w:t>
             </w:r>
@@ -1074,10 +623,9 @@
         </w:tc>
         <w:tc>
           <w:tcPr>
-            <w:tcW w:type="dxa" w:w="3456"/>
+            <w:tcW w:type="dxa" w:w="2880"/>
           </w:tcPr>
           <w:p>
-            <w:r/>
             <w:r>
               <w:t>RAGConfig</w:t>
             </w:r>
@@ -1087,10 +635,9 @@
       <w:tr>
         <w:tc>
           <w:tcPr>
-            <w:tcW w:type="dxa" w:w="3168"/>
+            <w:tcW w:type="dxa" w:w="2880"/>
           </w:tcPr>
           <w:p>
-            <w:r/>
             <w:r>
               <w:t>relevance_threshold</w:t>
             </w:r>
@@ -1098,10 +645,9 @@
         </w:tc>
         <w:tc>
           <w:tcPr>
-            <w:tcW w:type="dxa" w:w="2592"/>
+            <w:tcW w:type="dxa" w:w="2880"/>
           </w:tcPr>
           <w:p>
-            <w:r/>
             <w:r>
               <w:t>0.7</w:t>
             </w:r>
@@ -1109,12 +655,11 @@
         </w:tc>
         <w:tc>
           <w:tcPr>
-            <w:tcW w:type="dxa" w:w="3456"/>
+            <w:tcW w:type="dxa" w:w="2880"/>
           </w:tcPr>
           <w:p>
-            <w:r/>
             <w:r>
-              <w:t>RAGConfig</w:t>
+              <w:t>RAGConfig — grading cutoff</w:t>
             </w:r>
           </w:p>
         </w:tc>
@@ -1122,10 +667,9 @@
       <w:tr>
         <w:tc>
           <w:tcPr>
-            <w:tcW w:type="dxa" w:w="3168"/>
+            <w:tcW w:type="dxa" w:w="2880"/>
           </w:tcPr>
           <w:p>
-            <w:r/>
             <w:r>
               <w:t>confidence_threshold</w:t>
             </w:r>
@@ -1133,10 +677,9 @@
         </w:tc>
         <w:tc>
           <w:tcPr>
-            <w:tcW w:type="dxa" w:w="2592"/>
+            <w:tcW w:type="dxa" w:w="2880"/>
           </w:tcPr>
           <w:p>
-            <w:r/>
             <w:r>
               <w:t>0.6</w:t>
             </w:r>
@@ -1144,12 +687,11 @@
         </w:tc>
         <w:tc>
           <w:tcPr>
-            <w:tcW w:type="dxa" w:w="3456"/>
+            <w:tcW w:type="dxa" w:w="2880"/>
           </w:tcPr>
           <w:p>
-            <w:r/>
             <w:r>
-              <w:t>RAGConfig</w:t>
+              <w:t>RAGConfig — hallucination check</w:t>
             </w:r>
           </w:p>
         </w:tc>
@@ -1157,10 +699,9 @@
       <w:tr>
         <w:tc>
           <w:tcPr>
-            <w:tcW w:type="dxa" w:w="3168"/>
+            <w:tcW w:type="dxa" w:w="2880"/>
           </w:tcPr>
           <w:p>
-            <w:r/>
             <w:r>
               <w:t>search_top_k</w:t>
             </w:r>
@@ -1168,10 +709,9 @@
         </w:tc>
         <w:tc>
           <w:tcPr>
-            <w:tcW w:type="dxa" w:w="2592"/>
+            <w:tcW w:type="dxa" w:w="2880"/>
           </w:tcPr>
           <w:p>
-            <w:r/>
             <w:r>
               <w:t>5</w:t>
             </w:r>
@@ -1179,10 +719,9 @@
         </w:tc>
         <w:tc>
           <w:tcPr>
-            <w:tcW w:type="dxa" w:w="3456"/>
+            <w:tcW w:type="dxa" w:w="2880"/>
           </w:tcPr>
           <w:p>
-            <w:r/>
             <w:r>
               <w:t>VectorStoreConfig</w:t>
             </w:r>
@@ -1192,10 +731,9 @@
       <w:tr>
         <w:tc>
           <w:tcPr>
-            <w:tcW w:type="dxa" w:w="3168"/>
+            <w:tcW w:type="dxa" w:w="2880"/>
           </w:tcPr>
           <w:p>
-            <w:r/>
             <w:r>
               <w:t>chunk_size</w:t>
             </w:r>
@@ -1203,21 +741,19 @@
         </w:tc>
         <w:tc>
           <w:tcPr>
-            <w:tcW w:type="dxa" w:w="2592"/>
+            <w:tcW w:type="dxa" w:w="2880"/>
           </w:tcPr>
           <w:p>
-            <w:r/>
             <w:r>
-              <w:t>768 tokens</w:t>
+              <w:t>768 tokens (target)</w:t>
             </w:r>
           </w:p>
         </w:tc>
         <w:tc>
           <w:tcPr>
-            <w:tcW w:type="dxa" w:w="3456"/>
+            <w:tcW w:type="dxa" w:w="2880"/>
           </w:tcPr>
           <w:p>
-            <w:r/>
             <w:r>
               <w:t>ChunkingConfig</w:t>
             </w:r>
@@ -1227,10 +763,9 @@
       <w:tr>
         <w:tc>
           <w:tcPr>
-            <w:tcW w:type="dxa" w:w="3168"/>
+            <w:tcW w:type="dxa" w:w="2880"/>
           </w:tcPr>
           <w:p>
-            <w:r/>
             <w:r>
               <w:t>chunk_overlap_pct</w:t>
             </w:r>
@@ -1238,10 +773,9 @@
         </w:tc>
         <w:tc>
           <w:tcPr>
-            <w:tcW w:type="dxa" w:w="2592"/>
+            <w:tcW w:type="dxa" w:w="2880"/>
           </w:tcPr>
           <w:p>
-            <w:r/>
             <w:r>
               <w:t>0.15</w:t>
             </w:r>
@@ -1249,10 +783,9 @@
         </w:tc>
         <w:tc>
           <w:tcPr>
-            <w:tcW w:type="dxa" w:w="3456"/>
+            <w:tcW w:type="dxa" w:w="2880"/>
           </w:tcPr>
           <w:p>
-            <w:r/>
             <w:r>
               <w:t>ChunkingConfig</w:t>
             </w:r>
@@ -1262,10 +795,9 @@
       <w:tr>
         <w:tc>
           <w:tcPr>
-            <w:tcW w:type="dxa" w:w="3168"/>
+            <w:tcW w:type="dxa" w:w="2880"/>
           </w:tcPr>
           <w:p>
-            <w:r/>
             <w:r>
               <w:t>embedding_model</w:t>
             </w:r>
@@ -1273,10 +805,9 @@
         </w:tc>
         <w:tc>
           <w:tcPr>
-            <w:tcW w:type="dxa" w:w="2592"/>
+            <w:tcW w:type="dxa" w:w="2880"/>
           </w:tcPr>
           <w:p>
-            <w:r/>
             <w:r>
               <w:t>thenlper/gte-large</w:t>
             </w:r>
@@ -1284,10 +815,9 @@
         </w:tc>
         <w:tc>
           <w:tcPr>
-            <w:tcW w:type="dxa" w:w="3456"/>
+            <w:tcW w:type="dxa" w:w="2880"/>
           </w:tcPr>
           <w:p>
-            <w:r/>
             <w:r>
               <w:t>EmbeddingConfig</w:t>
             </w:r>
@@ -1297,10 +827,9 @@
       <w:tr>
         <w:tc>
           <w:tcPr>
-            <w:tcW w:type="dxa" w:w="3168"/>
+            <w:tcW w:type="dxa" w:w="2880"/>
           </w:tcPr>
           <w:p>
-            <w:r/>
             <w:r>
               <w:t>default_model_id</w:t>
             </w:r>
@@ -1308,10 +837,9 @@
         </w:tc>
         <w:tc>
           <w:tcPr>
-            <w:tcW w:type="dxa" w:w="2592"/>
+            <w:tcW w:type="dxa" w:w="2880"/>
           </w:tcPr>
           <w:p>
-            <w:r/>
             <w:r>
               <w:t>gemini_flash</w:t>
             </w:r>
@@ -1319,19 +847,50 @@
         </w:tc>
         <w:tc>
           <w:tcPr>
-            <w:tcW w:type="dxa" w:w="3456"/>
+            <w:tcW w:type="dxa" w:w="2880"/>
           </w:tcPr>
           <w:p>
-            <w:r/>
             <w:r>
-              <w:t>model registry</w:t>
+              <w:t>run_query default LLM</w:t>
             </w:r>
           </w:p>
         </w:tc>
       </w:tr>
     </w:tbl>
+    <w:p/>
+    <w:p>
+      <w:pPr>
+        <w:pStyle w:val="Heading1"/>
+      </w:pPr>
+      <w:r>
+        <w:t>Appendix B: Repository Map</w:t>
+      </w:r>
+    </w:p>
+    <w:p>
+      <w:pPr>
+        <w:spacing w:after="120"/>
+      </w:pPr>
+      <w:r>
+        <w:t>agents/ — base_agent.py, industrial_agent.py, recipe_agent.py, scientific_agent.py</w:t>
+        <w:br/>
+        <w:t>config/ — settings.py, prompts.py</w:t>
+        <w:br/>
+        <w:t>evaluation/ — metrics.py</w:t>
+        <w:br/>
+        <w:t>foundation/ — llm_wrapper.py, embedding_service.py, vector_store.py, model_registry.py</w:t>
+        <w:br/>
+        <w:t>ingestion/ — document_loader.py, chunking_pipeline.py, index_builder.py</w:t>
+        <w:br/>
+        <w:t>notebooks/ — main_demo.ipynb, Multi_Domain_Agent.ipynb</w:t>
+        <w:br/>
+        <w:t>orchestration/ — state_schema.py, supervisor.py, workflow_graph.py</w:t>
+        <w:br/>
+        <w:t>rag_core/ — crag_pipeline.py, retriever.py, document_grader.py, query_rewriter.py, response_generator.py, hallucination_checker.py</w:t>
+        <w:br/>
+        <w:t>tests/ — test_crag_pipeline.py, test_security.py</w:t>
+      </w:r>
+    </w:p>
     <w:sectPr>
-      <w:footerReference w:type="default" r:id="rId9"/>
       <w:pgSz w:w="12240" w:h="15840"/>
       <w:pgMar w:top="1440" w:right="1800" w:bottom="1440" w:left="1800" w:header="720" w:footer="720" w:gutter="0"/>
       <w:cols w:space="720"/>
@@ -1339,32 +898,6 @@
     </w:sectPr>
   </w:body>
 </w:document>
-</file>
-
-<file path=word/footer1.xml><?xml version="1.0" encoding="utf-8"?>
-<w:ftr xmlns:m="http://schemas.openxmlformats.org/officeDocument/2006/math" xmlns:mc="http://schemas.openxmlformats.org/markup-compatibility/2006" xmlns:mo="http://schemas.microsoft.com/office/mac/office/2008/main" xmlns:mv="urn:schemas-microsoft-com:mac:vml" xmlns:o="urn:schemas-microsoft-com:office:office" xmlns:r="http://schemas.openxmlformats.org/officeDocument/2006/relationships" xmlns:v="urn:schemas-microsoft-com:vml" xmlns:w10="urn:schemas-microsoft-com:office:word" xmlns:w14="http://schemas.microsoft.com/office/word/2010/wordml" xmlns:w="http://schemas.openxmlformats.org/wordprocessingml/2006/main" xmlns:wne="http://schemas.microsoft.com/office/word/2006/wordml" xmlns:wp14="http://schemas.microsoft.com/office/word/2010/wordprocessingDrawing" xmlns:wp="http://schemas.openxmlformats.org/drawingml/2006/wordprocessingDrawing" xmlns:wpc="http://schemas.microsoft.com/office/word/2010/wordprocessingCanvas" xmlns:wpg="http://schemas.microsoft.com/office/word/2010/wordprocessingGroup" xmlns:wpi="http://schemas.microsoft.com/office/word/2010/wordprocessingInk" xmlns:wps="http://schemas.microsoft.com/office/word/2010/wordprocessingShape" mc:Ignorable="w14 wp14">
-  <w:p>
-    <w:pPr>
-      <w:pStyle w:val="Footer"/>
-      <w:jc w:val="center"/>
-    </w:pPr>
-    <w:r>
-      <w:rPr>
-        <w:color w:val="555555"/>
-        <w:sz w:val="18"/>
-      </w:rPr>
-      <w:t xml:space="preserve">AI574 — Final Project Report  |  Page </w:t>
-    </w:r>
-    <w:r>
-      <w:rPr>
-        <w:sz w:val="18"/>
-      </w:rPr>
-      <w:fldChar w:fldCharType="begin"/>
-      <w:instrText xml:space="preserve">PAGE</w:instrText>
-      <w:fldChar w:fldCharType="end"/>
-    </w:r>
-  </w:p>
-</w:ftr>
 </file>
 
 <file path=word/numbering.xml><?xml version="1.0" encoding="utf-8"?>
@@ -1730,13 +1263,6 @@
     <w:name w:val="Normal"/>
     <w:qFormat/>
     <w:rsid w:val="00FC693F"/>
-    <w:pPr>
-      <w:spacing w:after="120" w:lineRule="auto" w:line="276"/>
-    </w:pPr>
-    <w:rPr>
-      <w:rFonts w:ascii="Arial" w:hAnsi="Arial"/>
-      <w:sz w:val="22"/>
-    </w:rPr>
   </w:style>
   <w:style w:type="paragraph" w:styleId="Header">
     <w:name w:val="header"/>
@@ -1793,15 +1319,15 @@
     <w:pPr>
       <w:keepNext/>
       <w:keepLines/>
-      <w:spacing w:before="200" w:after="120"/>
+      <w:spacing w:before="480" w:after="0"/>
       <w:outlineLvl w:val="0"/>
     </w:pPr>
     <w:rPr>
-      <w:rFonts w:asciiTheme="majorHAnsi" w:eastAsiaTheme="majorEastAsia" w:hAnsiTheme="majorHAnsi" w:cstheme="majorBidi" w:ascii="Arial" w:hAnsi="Arial"/>
+      <w:rFonts w:asciiTheme="majorHAnsi" w:eastAsiaTheme="majorEastAsia" w:hAnsiTheme="majorHAnsi" w:cstheme="majorBidi"/>
       <w:b/>
       <w:bCs/>
-      <w:color w:val="101010"/>
-      <w:sz w:val="40"/>
+      <w:color w:val="365F91" w:themeColor="accent1" w:themeShade="BF"/>
+      <w:sz w:val="28"/>
       <w:szCs w:val="28"/>
     </w:rPr>
   </w:style>
@@ -1817,15 +1343,15 @@
     <w:pPr>
       <w:keepNext/>
       <w:keepLines/>
-      <w:spacing w:before="200" w:after="120"/>
+      <w:spacing w:before="200" w:after="0"/>
       <w:outlineLvl w:val="1"/>
     </w:pPr>
     <w:rPr>
-      <w:rFonts w:asciiTheme="majorHAnsi" w:eastAsiaTheme="majorEastAsia" w:hAnsiTheme="majorHAnsi" w:cstheme="majorBidi" w:ascii="Arial" w:hAnsi="Arial"/>
+      <w:rFonts w:asciiTheme="majorHAnsi" w:eastAsiaTheme="majorEastAsia" w:hAnsiTheme="majorHAnsi" w:cstheme="majorBidi"/>
       <w:b/>
       <w:bCs/>
-      <w:color w:val="101010"/>
-      <w:sz w:val="30"/>
+      <w:color w:val="4F81BD" w:themeColor="accent1"/>
+      <w:sz w:val="26"/>
       <w:szCs w:val="26"/>
     </w:rPr>
   </w:style>
@@ -1841,15 +1367,14 @@
     <w:pPr>
       <w:keepNext/>
       <w:keepLines/>
-      <w:spacing w:before="200" w:after="120"/>
+      <w:spacing w:before="200" w:after="0"/>
       <w:outlineLvl w:val="2"/>
     </w:pPr>
     <w:rPr>
-      <w:rFonts w:asciiTheme="majorHAnsi" w:eastAsiaTheme="majorEastAsia" w:hAnsiTheme="majorHAnsi" w:cstheme="majorBidi" w:ascii="Arial" w:hAnsi="Arial"/>
+      <w:rFonts w:asciiTheme="majorHAnsi" w:eastAsiaTheme="majorEastAsia" w:hAnsiTheme="majorHAnsi" w:cstheme="majorBidi"/>
       <w:b/>
       <w:bCs/>
-      <w:color w:val="101010"/>
-      <w:sz w:val="24"/>
+      <w:color w:val="4F81BD" w:themeColor="accent1"/>
     </w:rPr>
   </w:style>
   <w:style w:type="paragraph" w:styleId="Heading4">
@@ -2083,16 +1608,15 @@
       <w:pBdr>
         <w:bottom w:val="single" w:sz="8" w:space="4" w:color="4F81BD" w:themeColor="accent1"/>
       </w:pBdr>
-      <w:spacing w:after="120" w:line="240" w:lineRule="auto" w:before="0"/>
+      <w:spacing w:after="300" w:line="240" w:lineRule="auto"/>
       <w:contextualSpacing/>
     </w:pPr>
     <w:rPr>
-      <w:rFonts w:asciiTheme="majorHAnsi" w:eastAsiaTheme="majorEastAsia" w:hAnsiTheme="majorHAnsi" w:cstheme="majorBidi" w:ascii="Arial" w:hAnsi="Arial"/>
-      <w:b/>
-      <w:color w:val="101010"/>
+      <w:rFonts w:asciiTheme="majorHAnsi" w:eastAsiaTheme="majorEastAsia" w:hAnsiTheme="majorHAnsi" w:cstheme="majorBidi"/>
+      <w:color w:val="17365D" w:themeColor="text2" w:themeShade="BF"/>
       <w:spacing w:val="5"/>
       <w:kern w:val="28"/>
-      <w:sz w:val="56"/>
+      <w:sz w:val="52"/>
       <w:szCs w:val="52"/>
     </w:rPr>
   </w:style>
@@ -13421,17 +12945,6 @@
         <w:shd w:val="clear" w:color="auto" w:fill="FBCAA2" w:themeFill="accent6" w:themeFillTint="7F"/>
       </w:tcPr>
     </w:tblStylePr>
-  </w:style>
-  <w:style w:type="paragraph" w:customStyle="1" w:styleId="CodeBlock">
-    <w:name w:val="CodeBlock"/>
-    <w:pPr>
-      <w:spacing w:before="80" w:after="120"/>
-      <w:ind w:left="360"/>
-    </w:pPr>
-    <w:rPr>
-      <w:rFonts w:ascii="Consolas" w:hAnsi="Consolas"/>
-      <w:sz w:val="19"/>
-    </w:rPr>
   </w:style>
 </w:styles>
 </file>

</xml_diff>